<commit_message>
Added docker action and place of foundation
</commit_message>
<xml_diff>
--- a/documents/example.docx
+++ b/documents/example.docx
@@ -800,59 +800,109 @@
         <w:spacing w:after="120" w:line="312" w:lineRule="auto"/>
         <w:jc w:val="both"/>
         <w:rPr>
-          <w:rFonts w:ascii="Times New Roman" w:hAnsi="Times New Roman"/>
-          <w:sz w:val="18"/>
-          <w:szCs w:val="18"/>
-          <w:u w:color="003366"/>
-          <w:lang w:val="ru-RU"/>
-        </w:rPr>
-      </w:pPr>
-    </w:p>
-    <w:p>
-      <w:pPr>
-        <w:pStyle w:val="Body"/>
-        <w:tabs>
-          <w:tab w:val="left" w:pos="4589"/>
-        </w:tabs>
-        <w:spacing w:after="120" w:line="312" w:lineRule="auto"/>
-        <w:jc w:val="both"/>
-        <w:rPr>
-          <w:rFonts w:ascii="Times New Roman" w:hAnsi="Times New Roman"/>
-          <w:color w:val="5E5E5E"/>
-          <w:sz w:val="15"/>
-          <w:szCs w:val="18"/>
-          <w:u w:color="003366"/>
-          <w:lang w:val="ru-RU"/>
-        </w:rPr>
-      </w:pPr>
-      <w:r>
-        <w:rPr>
-          <w:rFonts w:ascii="Times New Roman" w:hAnsi="Times New Roman"/>
-          <w:color w:val="5E5E5E"/>
-          <w:sz w:val="15"/>
-          <w:szCs w:val="18"/>
-          <w:u w:color="003366"/>
-          <w:lang w:val="ru-RU"/>
-        </w:rPr>
-        <w:t>_______________________________________________________________________________________________________________________________</w:t>
-      </w:r>
-    </w:p>
-    <w:p>
-      <w:pPr>
-        <w:pStyle w:val="Body"/>
-        <w:tabs>
-          <w:tab w:val="left" w:pos="4589"/>
-        </w:tabs>
-        <w:spacing w:after="120" w:line="312" w:lineRule="auto"/>
-        <w:rPr>
-          <w:rFonts w:ascii="Times New Roman" w:hAnsi="Times New Roman"/>
-          <w:color w:val="5E5E5E"/>
-          <w:sz w:val="15"/>
-          <w:szCs w:val="18"/>
-          <w:u w:color="003366"/>
-          <w:lang w:val="ru-RU"/>
-        </w:rPr>
-      </w:pPr>
+          <w:rFonts w:ascii="Helvetica" w:eastAsia="Helvetica" w:hAnsi="Helvetica" w:cs="Helvetica"/>
+          <w:sz w:val="18"/>
+          <w:szCs w:val="18"/>
+          <w:u w:val="single"/>
+          <w:lang w:val="en-US"/>
+        </w:rPr>
+      </w:pPr>
+      <w:r>
+        <w:rPr>
+          <w:rFonts w:ascii="Helvetica" w:eastAsia="Helvetica" w:hAnsi="Helvetica" w:cs="Helvetica"/>
+          <w:sz w:val="18"/>
+          <w:szCs w:val="18"/>
+          <w:u w:color="003366"/>
+          <w:lang w:val="ru-RU"/>
+        </w:rPr>
+        <w:t>Найден(а)</w:t>
+      </w:r>
+      <w:r>
+        <w:rPr>
+          <w:rFonts w:ascii="Helvetica" w:eastAsia="Helvetica" w:hAnsi="Helvetica" w:cs="Helvetica"/>
+          <w:sz w:val="18"/>
+          <w:szCs w:val="18"/>
+          <w:u w:color="003366"/>
+          <w:lang w:val="ru-RU"/>
+        </w:rPr>
+        <w:t xml:space="preserve"> </w:t>
+      </w:r>
+      <w:r>
+        <w:rPr>
+          <w:rFonts w:ascii="Helvetica" w:eastAsia="Helvetica" w:hAnsi="Helvetica" w:cs="Helvetica"/>
+          <w:sz w:val="18"/>
+          <w:szCs w:val="18"/>
+          <w:u w:color="003366"/>
+          <w:lang w:val="en-US"/>
+        </w:rPr>
+        <w:t xml:space="preserve">  </w:t>
+      </w:r>
+      <w:r>
+        <w:rPr>
+          <w:rFonts w:ascii="Helvetica" w:eastAsia="Helvetica" w:hAnsi="Helvetica" w:cs="Helvetica"/>
+          <w:sz w:val="18"/>
+          <w:szCs w:val="18"/>
+          <w:u w:val="single"/>
+          <w:lang w:val="ru-RU"/>
+        </w:rPr>
+        <w:t>{{</w:t>
+      </w:r>
+      <w:r>
+        <w:rPr>
+          <w:rFonts w:ascii="Helvetica" w:eastAsia="Helvetica" w:hAnsi="Helvetica" w:cs="Helvetica"/>
+          <w:sz w:val="18"/>
+          <w:szCs w:val="18"/>
+          <w:u w:val="single"/>
+          <w:lang w:val="en-US"/>
+        </w:rPr>
+        <w:t>place</w:t>
+      </w:r>
+      <w:r>
+        <w:rPr>
+          <w:rFonts w:ascii="Helvetica" w:eastAsia="Helvetica" w:hAnsi="Helvetica" w:cs="Helvetica"/>
+          <w:sz w:val="18"/>
+          <w:szCs w:val="18"/>
+          <w:u w:val="single"/>
+          <w:lang w:val="ru-RU"/>
+        </w:rPr>
+        <w:t>}}</w:t>
+      </w:r>
+    </w:p>
+    <w:p>
+      <w:pPr>
+        <w:pStyle w:val="Body"/>
+        <w:tabs>
+          <w:tab w:val="left" w:pos="9639"/>
+        </w:tabs>
+        <w:spacing w:line="360" w:lineRule="auto"/>
+        <w:rPr>
+          <w:rFonts w:ascii="Helvetica" w:eastAsia="Helvetica" w:hAnsi="Helvetica" w:cs="Helvetica"/>
+          <w:sz w:val="18"/>
+          <w:szCs w:val="18"/>
+          <w:u w:color="003366"/>
+          <w:lang w:val="en-US"/>
+        </w:rPr>
+      </w:pPr>
+      <w:r>
+        <w:rPr>
+          <w:rFonts w:ascii="Helvetica" w:eastAsia="Helvetica" w:hAnsi="Helvetica" w:cs="Helvetica"/>
+          <w:sz w:val="18"/>
+          <w:szCs w:val="18"/>
+          <w:u w:color="003366"/>
+          <w:lang w:val="ru-RU"/>
+        </w:rPr>
+        <w:t>______________________________________________________________________________________________</w:t>
+      </w:r>
+      <w:r>
+        <w:rPr>
+          <w:rFonts w:ascii="Helvetica" w:eastAsia="Helvetica" w:hAnsi="Helvetica" w:cs="Helvetica"/>
+          <w:sz w:val="18"/>
+          <w:szCs w:val="18"/>
+          <w:u w:color="003366"/>
+          <w:lang w:val="ru-RU"/>
+        </w:rPr>
+        <w:t xml:space="preserve"> </w:t>
+      </w:r>
     </w:p>
     <w:p>
       <w:pPr>
@@ -3626,4 +3676,10 @@
   </a:objectDefaults>
   <a:extraClrSchemeLst/>
 </a:theme>
+</file>
+
+<file path=docMetadata/LabelInfo.xml><?xml version="1.0" encoding="utf-8"?>
+<clbl:labelList xmlns:clbl="http://schemas.microsoft.com/office/2020/mipLabelMetadata">
+  <clbl:label id="{96a66e58-4b85-455b-87c5-db0ab19663cd}" enabled="1" method="Standard" siteId="{3ec00d79-021a-42d4-aac8-dcb35973dff2}" contentBits="0" removed="0"/>
+</clbl:labelList>
 </file>
</xml_diff>